<commit_message>
Say context file, and point it at a new project
The city config template said to upload it to your Claude project as a
project file, which is the wrong term and does not say which project.
It now reads: fill this in once, then create a new Claude project for
your newsletter and upload this file to it as a context file, with
context file in bold since that is the step people get wrong.

Aligned the site to the same words: setup step 4 heading and body, the
download list, and the troubleshooting entry all say context file now
rather than project knowledge. Both the doc and the site warn against
attaching it to a single chat, where it is forgotten on the next
conversation. Toolkit zip rebuilt.

Co-Authored-By: Claude Fable 5 <noreply@anthropic.com>
</commit_message>
<xml_diff>
--- a/downloads/city-config-template.docx
+++ b/downloads/city-config-template.docx
@@ -31,6 +31,32 @@
     </w:p>
     <w:p>
       <w:pPr>
+        <w:spacing w:after="120"/>
+      </w:pPr>
+      <w:r>
+        <w:rPr>
+          <w:b w:val="0"/>
+          <w:sz w:val="22"/>
+        </w:rPr>
+        <w:t xml:space="preserve">Fill this in once. Then create a new Claude project for your newsletter and upload this file to it as a </w:t>
+      </w:r>
+      <w:r>
+        <w:rPr>
+          <w:b/>
+          <w:sz w:val="22"/>
+        </w:rPr>
+        <w:t>context file</w:t>
+      </w:r>
+      <w:r>
+        <w:rPr>
+          <w:b w:val="0"/>
+          <w:sz w:val="22"/>
+        </w:rPr>
+        <w:t>, so every conversation inside that project can see it. All three skills read your city settings from there, which is why you never have to re-explain your timezone, your scope rule, or your sign-off.</w:t>
+      </w:r>
+    </w:p>
+    <w:p>
+      <w:pPr>
         <w:spacing w:after="120" w:before="0"/>
       </w:pPr>
       <w:r>
@@ -39,7 +65,7 @@
           <w:i w:val="0"/>
           <w:sz w:val="22"/>
         </w:rPr>
-        <w:t>Fill this in once, then upload it to your Claude project as a project file. All three skills read it from there, so you never have to re-explain your city. Replace everything in square brackets and delete the grey guidance lines as you go.</w:t>
+        <w:t>Replace everything in square brackets, and delete the grey guidance lines as you go.</w:t>
       </w:r>
     </w:p>
     <w:p>
@@ -53,7 +79,7 @@
           <w:color w:val="00754A"/>
           <w:sz w:val="20"/>
         </w:rPr>
-        <w:t>Save as: city-config.docx  (or export to PDF or Markdown, any of which Claude can read)</w:t>
+        <w:t>Save as: city-config.docx  (or export to PDF or Markdown, any of which Claude can read). Attach it to the project itself, not to a single chat, or it will be forgotten the next time you start a conversation.</w:t>
       </w:r>
     </w:p>
     <w:p>

</xml_diff>